<commit_message>
Research on the new engine, updated report, log and docs
- walk-forward against the best backtest with hindsight on the same years
- out-of-sample decay, cost sensitivity, fill timing, stress and portfolios
- Strategy Research report rewritten, Development Log extended
- retire feeds.py (replaced by market_data.py and simulator.py)
</commit_message>
<xml_diff>
--- a/Agora - Development Log.docx
+++ b/Agora - Development Log.docx
@@ -76,7 +76,7 @@
           <w:sz w:val="19"/>
           <w:szCs w:val="19"/>
         </w:rPr>
-        <w:t xml:space="preserve">Investment portfolio  .  Quantitative project  .  August 2026</w:t>
+        <w:t>Investment portfolio  .  Quantitative project  .  August to September 2026</w:t>
       </w:r>
     </w:p>
     <w:p>
@@ -597,23 +597,359 @@
           <w:sz w:val="22"/>
           <w:szCs w:val="22"/>
         </w:rPr>
-        <w:t xml:space="preserve">I also tidied the layout so the side panels can be collapsed, and this log is the final piece.</w:t>
-      </w:r>
-    </w:p>
-    <w:p>
-      <w:pPr>
-        <w:pStyle w:val="Heading1"/>
-        <w:spacing w:after="120" w:before="320"/>
-      </w:pPr>
-      <w:r>
-        <w:rPr>
-          <w:b/>
-          <w:bCs/>
-          <w:color w:val="1b2a4a"/>
-          <w:sz w:val="28"/>
-          <w:szCs w:val="28"/>
-        </w:rPr>
-        <w:t xml:space="preserve">13. What I took out, and why</w:t>
+        <w:t>I also tidied the layout so the side panels can be collapsed, and wrote the first version of this log.</w:t>
+      </w:r>
+    </w:p>
+    <w:p>
+      <w:pPr>
+        <w:pStyle w:val="Heading1"/>
+        <w:spacing w:after="120" w:before="320"/>
+      </w:pPr>
+      <w:r>
+        <w:rPr>
+          <w:b/>
+          <w:bCs/>
+          <w:color w:val="1b2a4a"/>
+          <w:sz w:val="28"/>
+          <w:szCs w:val="28"/>
+        </w:rPr>
+        <w:t>13. Following the real market, not a snapshot</w:t>
+      </w:r>
+    </w:p>
+    <w:p>
+      <w:pPr>
+        <w:spacing w:after="140" w:line="288"/>
+        <w:jc w:val="both"/>
+      </w:pPr>
+      <w:r>
+        <w:rPr>
+          <w:color w:val="202733"/>
+          <w:sz w:val="22"/>
+          <w:szCs w:val="22"/>
+        </w:rPr>
+        <w:t>Two problems came up once the page was online. The simulation always played out the same way after a restart, because the page replayed one saved run. And the real prices were a snapshot from the day I built the page, so they went stale.</w:t>
+      </w:r>
+    </w:p>
+    <w:p>
+      <w:pPr>
+        <w:spacing w:after="140" w:line="288"/>
+        <w:jc w:val="both"/>
+      </w:pPr>
+      <w:r>
+        <w:rPr>
+          <w:color w:val="202733"/>
+          <w:sz w:val="22"/>
+          <w:szCs w:val="22"/>
+        </w:rPr>
+        <w:t>I moved the simulation into the browser, so every visit and every new market starts fresh and random from the first candle. For the real prices I set up a small job on GitHub that downloads fresh prices every morning and rebuilds the page, so the live site follows the market by itself.</w:t>
+      </w:r>
+    </w:p>
+    <w:p>
+      <w:pPr>
+        <w:pStyle w:val="Heading1"/>
+        <w:spacing w:after="120" w:before="320"/>
+      </w:pPr>
+      <w:r>
+        <w:rPr>
+          <w:b/>
+          <w:bCs/>
+          <w:color w:val="1b2a4a"/>
+          <w:sz w:val="28"/>
+          <w:szCs w:val="28"/>
+        </w:rPr>
+        <w:t>14. Starting again with a proper structure</w:t>
+      </w:r>
+    </w:p>
+    <w:p>
+      <w:pPr>
+        <w:spacing w:after="140" w:line="288"/>
+        <w:jc w:val="both"/>
+      </w:pPr>
+      <w:r>
+        <w:rPr>
+          <w:color w:val="202733"/>
+          <w:sz w:val="22"/>
+          <w:szCs w:val="22"/>
+        </w:rPr>
+        <w:t>At this point I stepped back. The idea was right, but the way it had been built was not. The strategies were tangled up with the chart, and each market came as one fixed snapshot. I split Agora into four parts, the way real backtesting systems are split. Market data, a strategy engine, a market simulator, and a strategy tester that feeds a research report.</w:t>
+      </w:r>
+    </w:p>
+    <w:p>
+      <w:pPr>
+        <w:spacing w:after="140" w:line="288"/>
+        <w:jc w:val="both"/>
+      </w:pPr>
+      <w:r>
+        <w:rPr>
+          <w:color w:val="202733"/>
+          <w:sz w:val="22"/>
+          <w:szCs w:val="22"/>
+        </w:rPr>
+        <w:t>The rule that holds it together is that a strategy should not know whether its prices are real or made up. It just receives bars. So the same rule can be tested on Tesla, on Microsoft, on a made up crash, or on a very volatile market without changing a line.</w:t>
+      </w:r>
+    </w:p>
+    <w:p>
+      <w:pPr>
+        <w:spacing w:after="140" w:line="288"/>
+        <w:jc w:val="both"/>
+      </w:pPr>
+      <w:r>
+        <w:rPr>
+          <w:color w:val="202733"/>
+          <w:sz w:val="22"/>
+          <w:szCs w:val="22"/>
+        </w:rPr>
+        <w:t>I widened the data to 29 companies across seven sectors, five indices to compare against, and ten years of daily prices each. The first research report came out of this stage. It also taught me something about my own simulator. The full agent market can run away to absurd prices on some random starts, so it was useless for stress testing. I built a set of simple, controlled synthetic markets for that job instead.</w:t>
+      </w:r>
+    </w:p>
+    <w:p>
+      <w:pPr>
+        <w:pStyle w:val="Heading1"/>
+        <w:spacing w:after="120" w:before="320"/>
+      </w:pPr>
+      <w:r>
+        <w:rPr>
+          <w:b/>
+          <w:bCs/>
+          <w:color w:val="1b2a4a"/>
+          <w:sz w:val="28"/>
+          <w:szCs w:val="28"/>
+        </w:rPr>
+        <w:t>15. Opening up the data on the page</w:t>
+      </w:r>
+    </w:p>
+    <w:p>
+      <w:pPr>
+        <w:spacing w:after="140" w:line="288"/>
+        <w:jc w:val="both"/>
+      </w:pPr>
+      <w:r>
+        <w:rPr>
+          <w:color w:val="202733"/>
+          <w:sz w:val="22"/>
+          <w:szCs w:val="22"/>
+        </w:rPr>
+        <w:t>The web page still carried every price inside one big file. I changed it to load each market only when it is picked, which took the page from 589 KB to 55 KB. It gained a picker grouped by sector, the benchmark index drawn next to the strategy, and a small demo of recent 1 hour and 1 minute prices.</w:t>
+      </w:r>
+    </w:p>
+    <w:p>
+      <w:pPr>
+        <w:pStyle w:val="Heading1"/>
+        <w:spacing w:after="120" w:before="320"/>
+      </w:pPr>
+      <w:r>
+        <w:rPr>
+          <w:b/>
+          <w:bCs/>
+          <w:color w:val="1b2a4a"/>
+          <w:sz w:val="28"/>
+          <w:szCs w:val="28"/>
+        </w:rPr>
+        <w:t>16. A backtest that cannot see the future</w:t>
+      </w:r>
+    </w:p>
+    <w:p>
+      <w:pPr>
+        <w:spacing w:after="140" w:line="288"/>
+        <w:jc w:val="both"/>
+      </w:pPr>
+      <w:r>
+        <w:rPr>
+          <w:color w:val="202733"/>
+          <w:sz w:val="22"/>
+          <w:szCs w:val="22"/>
+        </w:rPr>
+        <w:t>This was the biggest change of the whole project. My tester had been filling each trade at the same closing price that triggered it. That sounds harmless, but it quietly assumes you could trade at a price that only existed once the day was over. I rebuilt the engine to walk through time one bar at a time. A bar only reaches the strategy once it has closed, and any order waits for the next bar's open.</w:t>
+      </w:r>
+    </w:p>
+    <w:p>
+      <w:pPr>
+        <w:spacing w:after="140" w:line="288"/>
+        <w:jc w:val="both"/>
+      </w:pPr>
+      <w:r>
+        <w:rPr>
+          <w:color w:val="202733"/>
+          <w:sz w:val="22"/>
+          <w:szCs w:val="22"/>
+        </w:rPr>
+        <w:t>Prices needed the same care. The data source gives prices already adjusted for splits, which is fine, because every percentage move stays real. But the dividend adjusted price, the one many tutorials use, changes past prices whenever a later dividend is paid, and that leaks the future into the past. So the tester trades on split adjusted prices and pays dividends in as cash on the day they happen. I also moved all times to each exchange's own time zone and started dropping any bar that had not finished yet.</w:t>
+      </w:r>
+    </w:p>
+    <w:p>
+      <w:pPr>
+        <w:spacing w:after="140" w:line="288"/>
+        <w:jc w:val="both"/>
+      </w:pPr>
+      <w:r>
+        <w:rPr>
+          <w:color w:val="202733"/>
+          <w:sz w:val="22"/>
+          <w:szCs w:val="22"/>
+        </w:rPr>
+        <w:t>Saying the engine has no look-ahead is easy. I wanted a test that proves it. The test runs a strategy on ten years of prices, then runs it again with the future deleted, at four different dates. The results before each date do not change by a single digit. If the engine were peeking, deleting the future would change the past.</w:t>
+      </w:r>
+    </w:p>
+    <w:p>
+      <w:pPr>
+        <w:pStyle w:val="Heading1"/>
+        <w:spacing w:after="120" w:before="320"/>
+      </w:pPr>
+      <w:r>
+        <w:rPr>
+          <w:b/>
+          <w:bCs/>
+          <w:color w:val="1b2a4a"/>
+          <w:sz w:val="28"/>
+          <w:szCs w:val="28"/>
+        </w:rPr>
+        <w:t>17. Signal, order, fill, and a real account</w:t>
+      </w:r>
+    </w:p>
+    <w:p>
+      <w:pPr>
+        <w:spacing w:after="140" w:line="288"/>
+        <w:jc w:val="both"/>
+      </w:pPr>
+      <w:r>
+        <w:rPr>
+          <w:color w:val="202733"/>
+          <w:sz w:val="22"/>
+          <w:szCs w:val="22"/>
+        </w:rPr>
+        <w:t>The next step was to stop strategies deciding everything. Now a strategy only says buy, sell or hold, and why. A sizing rule decides how much. The account applies its limits (the most in one company, how much borrowing, whole shares only). Then an execution model decides the actual price. It adds the bid and ask spread, slippage, the price impact of a large order and commission, and it will not let one order be more than a tenth of a normal day's trading.</w:t>
+      </w:r>
+    </w:p>
+    <w:p>
+      <w:pPr>
+        <w:spacing w:after="140" w:line="288"/>
+        <w:jc w:val="both"/>
+      </w:pPr>
+      <w:r>
+        <w:rPr>
+          <w:color w:val="202733"/>
+          <w:sz w:val="22"/>
+          <w:szCs w:val="22"/>
+        </w:rPr>
+        <w:t>The account now works like a broker's. It holds cash and several positions at once, knows the average price paid, splits profit into realised and unrealised, allows short selling, and issues a margin call if a short runs too far against it. The trade log reads the way a real one does. Buy 1,653 shares, expected 60.43, filled at 60.46, fee 49.97, and so on.</w:t>
+      </w:r>
+    </w:p>
+    <w:p>
+      <w:pPr>
+        <w:pStyle w:val="Heading1"/>
+        <w:spacing w:after="120" w:before="320"/>
+      </w:pPr>
+      <w:r>
+        <w:rPr>
+          <w:b/>
+          <w:bCs/>
+          <w:color w:val="1b2a4a"/>
+          <w:sz w:val="28"/>
+          <w:szCs w:val="28"/>
+        </w:rPr>
+        <w:t>18. Testing fairly, and the mistakes it caught</w:t>
+      </w:r>
+    </w:p>
+    <w:p>
+      <w:pPr>
+        <w:spacing w:after="140" w:line="288"/>
+        <w:jc w:val="both"/>
+      </w:pPr>
+      <w:r>
+        <w:rPr>
+          <w:color w:val="202733"/>
+          <w:sz w:val="22"/>
+          <w:szCs w:val="22"/>
+        </w:rPr>
+        <w:t>A single backtest proves very little, so the tester now has four methods. A plain backtest, an out-of-sample test that tunes on the early years and judges on the later ones, a walk-forward test that does that year after year, and a stress test on six synthetic markets. Every result also shows what happens with more slippage and with the optimistic same close fills.</w:t>
+      </w:r>
+    </w:p>
+    <w:p>
+      <w:pPr>
+        <w:spacing w:after="140" w:line="288"/>
+        <w:jc w:val="both"/>
+      </w:pPr>
+      <w:r>
+        <w:rPr>
+          <w:color w:val="202733"/>
+          <w:sz w:val="22"/>
+          <w:szCs w:val="22"/>
+        </w:rPr>
+        <w:t>The browser needed the same engine, so the page runs a line by line JavaScript copy of the Python one. A parity test runs eight experiments through both and checks that every number matches, so the page and the report cannot disagree.</w:t>
+      </w:r>
+    </w:p>
+    <w:p>
+      <w:pPr>
+        <w:spacing w:after="140" w:line="288"/>
+        <w:jc w:val="both"/>
+      </w:pPr>
+      <w:r>
+        <w:rPr>
+          <w:color w:val="202733"/>
+          <w:sz w:val="22"/>
+          <w:szCs w:val="22"/>
+        </w:rPr>
+        <w:t>Questioning results that looked too good caught three mistakes. My first comparison said the walk-forward test beat the plain backtest, which made no sense until I saw the two covered different years with different settings. The fair comparison is the best settings picked with hindsight on the same years, and against that the honest result was around eight points a year lower. The trade statistics claimed one strategy won 20% of its trades with a profit factor of 0.11 while making 77%, because its best trades were still open at the end of each test year and were not being counted. And a test only three hours long reported a Sharpe ratio of 36, which is what happens when a few hours are stretched into a year. All three are fixed now.</w:t>
+      </w:r>
+    </w:p>
+    <w:p>
+      <w:pPr>
+        <w:pStyle w:val="Heading1"/>
+        <w:spacing w:after="120" w:before="320"/>
+      </w:pPr>
+      <w:r>
+        <w:rPr>
+          <w:b/>
+          <w:bCs/>
+          <w:color w:val="1b2a4a"/>
+          <w:sz w:val="28"/>
+          <w:szCs w:val="28"/>
+        </w:rPr>
+        <w:t>19. Scrolling through real history</w:t>
+      </w:r>
+    </w:p>
+    <w:p>
+      <w:pPr>
+        <w:spacing w:after="140" w:line="288"/>
+        <w:jc w:val="both"/>
+      </w:pPr>
+      <w:r>
+        <w:rPr>
+          <w:color w:val="202733"/>
+          <w:sz w:val="22"/>
+          <w:szCs w:val="22"/>
+        </w:rPr>
+        <w:t>The last request was to move around the real market freely, instead of looking at one squashed picture. The chart now holds the whole ten years. You drag to scroll and use the wheel to zoom, and the candles change size to suit, daily when zoomed in, weekly or monthly when zoomed out. A strip underneath maps the whole history, and there is a log scale for long views.</w:t>
+      </w:r>
+    </w:p>
+    <w:p>
+      <w:pPr>
+        <w:spacing w:after="140" w:line="288"/>
+        <w:jc w:val="both"/>
+      </w:pPr>
+      <w:r>
+        <w:rPr>
+          <w:color w:val="202733"/>
+          <w:sz w:val="22"/>
+          <w:szCs w:val="22"/>
+        </w:rPr>
+        <w:t>The part I like most is replay. You pick a day in the past and step forward one bar at a time, with everything after it hidden. The tester reruns using only what was known on that day, so you can watch a strategy make its decisions the way you would have faced them. It is the time frontier made visible.</w:t>
+      </w:r>
+    </w:p>
+    <w:p>
+      <w:pPr>
+        <w:pStyle w:val="Heading1"/>
+        <w:spacing w:after="120" w:before="320"/>
+      </w:pPr>
+      <w:r>
+        <w:rPr>
+          <w:b/>
+          <w:bCs/>
+          <w:color w:val="1b2a4a"/>
+          <w:sz w:val="28"/>
+          <w:szCs w:val="28"/>
+        </w:rPr>
+        <w:t>20. What I took out, and why</w:t>
       </w:r>
     </w:p>
     <w:p>
@@ -690,46 +1026,136 @@
     </w:p>
     <w:p>
       <w:pPr>
-        <w:pStyle w:val="Heading1"/>
-        <w:spacing w:after="120" w:before="320"/>
-      </w:pPr>
-      <w:r>
-        <w:rPr>
-          <w:b/>
-          <w:bCs/>
-          <w:color w:val="1b2a4a"/>
-          <w:sz w:val="28"/>
-          <w:szCs w:val="28"/>
-        </w:rPr>
-        <w:t xml:space="preserve">14. Where it stands, and honest notes</w:t>
-      </w:r>
-    </w:p>
-    <w:p>
-      <w:pPr>
-        <w:spacing w:after="140" w:line="288"/>
-        <w:jc w:val="both"/>
-      </w:pPr>
-      <w:r>
-        <w:rPr>
-          <w:color w:val="202733"/>
-          <w:sz w:val="22"/>
-          <w:szCs w:val="22"/>
-        </w:rPr>
-        <w:t xml:space="preserve">The simulator works. It passes both realism checks on all four scenarios. It has ten trader types, a leverage crash, a circuit breaker, real market data, and a strategy tester that runs on both the simulation and the real prices.</w:t>
-      </w:r>
-    </w:p>
-    <w:p>
-      <w:pPr>
-        <w:spacing w:after="140" w:line="288"/>
-        <w:jc w:val="both"/>
-      </w:pPr>
-      <w:r>
-        <w:rPr>
-          <w:color w:val="202733"/>
-          <w:sz w:val="22"/>
-          <w:szCs w:val="22"/>
-        </w:rPr>
-        <w:t xml:space="preserve">Some honest limits. The settings are a rough calibration, not fitted to any one real asset. The full market can, on some random starts, crash all the way to zero, because the panic herd has no floor under it. The real prices are a snapshot, not a live feed. And the strategy tester assumes it does not move the market, which is the standard way to test a strategy but not the whole story.</w:t>
+        <w:pStyle w:val="ListParagraph"/>
+        <w:numPr>
+          <w:ilvl w:val="0"/>
+          <w:numId w:val="1"/>
+        </w:numPr>
+        <w:spacing w:after="70" w:line="276"/>
+      </w:pPr>
+      <w:r>
+        <w:rPr>
+          <w:color w:val="202733"/>
+          <w:sz w:val="22"/>
+          <w:szCs w:val="22"/>
+        </w:rPr>
+        <w:t>The one big file of prices inside the page. Replaced by loading each market when it is picked.</w:t>
+      </w:r>
+    </w:p>
+    <w:p>
+      <w:pPr>
+        <w:pStyle w:val="ListParagraph"/>
+        <w:numPr>
+          <w:ilvl w:val="0"/>
+          <w:numId w:val="1"/>
+        </w:numPr>
+        <w:spacing w:after="70" w:line="276"/>
+      </w:pPr>
+      <w:r>
+        <w:rPr>
+          <w:color w:val="202733"/>
+          <w:sz w:val="22"/>
+          <w:szCs w:val="22"/>
+        </w:rPr>
+        <w:t>Filling trades at the same close that triggered them. Kept only as an optimistic comparison, because it assumes you could trade at a price you had not seen yet.</w:t>
+      </w:r>
+    </w:p>
+    <w:p>
+      <w:pPr>
+        <w:pStyle w:val="ListParagraph"/>
+        <w:numPr>
+          <w:ilvl w:val="0"/>
+          <w:numId w:val="1"/>
+        </w:numPr>
+        <w:spacing w:after="70" w:line="276"/>
+      </w:pPr>
+      <w:r>
+        <w:rPr>
+          <w:color w:val="202733"/>
+          <w:sz w:val="22"/>
+          <w:szCs w:val="22"/>
+        </w:rPr>
+        <w:t>The dividend adjusted price for trading decisions. It rewrites the past with dividends that were paid later.</w:t>
+      </w:r>
+    </w:p>
+    <w:p>
+      <w:pPr>
+        <w:pStyle w:val="ListParagraph"/>
+        <w:numPr>
+          <w:ilvl w:val="0"/>
+          <w:numId w:val="1"/>
+        </w:numPr>
+        <w:spacing w:after="70" w:line="276"/>
+      </w:pPr>
+      <w:r>
+        <w:rPr>
+          <w:color w:val="202733"/>
+          <w:sz w:val="22"/>
+          <w:szCs w:val="22"/>
+        </w:rPr>
+        <w:t>The horizon buttons that cut the data down. Replaced by zooming, which keeps the whole history in view, and a separate test period.</w:t>
+      </w:r>
+    </w:p>
+    <w:p>
+      <w:pPr>
+        <w:pStyle w:val="ListParagraph"/>
+        <w:numPr>
+          <w:ilvl w:val="0"/>
+          <w:numId w:val="1"/>
+        </w:numPr>
+        <w:spacing w:after="70" w:line="276"/>
+      </w:pPr>
+      <w:r>
+        <w:rPr>
+          <w:color w:val="202733"/>
+          <w:sz w:val="22"/>
+          <w:szCs w:val="22"/>
+        </w:rPr>
+        <w:t>The agent market as the stress test. Replaced by controlled synthetic markets, because the agent market can run away on some random starts.</w:t>
+      </w:r>
+    </w:p>
+    <w:p>
+      <w:pPr>
+        <w:pStyle w:val="Heading1"/>
+        <w:spacing w:after="120" w:before="320"/>
+      </w:pPr>
+      <w:r>
+        <w:rPr>
+          <w:b/>
+          <w:bCs/>
+          <w:color w:val="1b2a4a"/>
+          <w:sz w:val="28"/>
+          <w:szCs w:val="28"/>
+        </w:rPr>
+        <w:t>21. Where it stands, and honest notes</w:t>
+      </w:r>
+    </w:p>
+    <w:p>
+      <w:pPr>
+        <w:spacing w:after="140" w:line="288"/>
+        <w:jc w:val="both"/>
+      </w:pPr>
+      <w:r>
+        <w:rPr>
+          <w:color w:val="202733"/>
+          <w:sz w:val="22"/>
+          <w:szCs w:val="22"/>
+        </w:rPr>
+        <w:t>The simulator still works and passes both realism checks. Around it there is now a proper research tool. It has 29 companies and 6 indices refreshed daily, a backtest engine tested for look-ahead, a realistic execution model and account, four ways to test a rule, and a web page that runs the same engine and lets you scroll through or replay ten years of prices.</w:t>
+      </w:r>
+    </w:p>
+    <w:p>
+      <w:pPr>
+        <w:spacing w:after="140" w:line="288"/>
+        <w:jc w:val="both"/>
+      </w:pPr>
+      <w:r>
+        <w:rPr>
+          <w:color w:val="202733"/>
+          <w:sz w:val="22"/>
+          <w:szCs w:val="22"/>
+        </w:rPr>
+        <w:t>Some honest limits. The twelve companies in the research were picked knowing they did well, which flatters buy and hold. The costs are modelled, not measured from real order books. Intraday data only goes back a week at one minute. And the main answer the research gave, that none of the simple rules beat holding these shares once tested fairly, comes from one ten year period that was mostly a rising market.</w:t>
       </w:r>
     </w:p>
     <w:p>

</xml_diff>